<commit_message>
fix authors & typos
</commit_message>
<xml_diff>
--- a/documentation/src/domain-model-v0.1.docx
+++ b/documentation/src/domain-model-v0.1.docx
@@ -137,7 +137,7 @@
           <w:sz w:val="32"/>
           <w:lang w:val="en-GB"/>
         </w:rPr>
-        <w:t>domain-model-</w:t>
+        <w:t>domain-model</w:t>
       </w:r>
       <w:r>
         <w:rPr>
@@ -271,22 +271,7 @@
         <w:rPr>
           <w:rFonts w:ascii="Calibri" w:hAnsi="Calibri" w:cs="Calibri"/>
         </w:rPr>
-        <w:t xml:space="preserve"> Ιωάννης ΑΜ: 1084531</w:t>
-      </w:r>
-    </w:p>
-    <w:p>
-      <w:pPr>
-        <w:spacing w:after="87"/>
-        <w:ind w:left="730"/>
-        <w:rPr>
-          <w:rFonts w:ascii="Calibri" w:hAnsi="Calibri" w:cs="Calibri"/>
-        </w:rPr>
-      </w:pPr>
-      <w:r>
-        <w:rPr>
-          <w:rFonts w:ascii="Calibri" w:hAnsi="Calibri" w:cs="Calibri"/>
-        </w:rPr>
-        <w:t>Έτος: 5ο</w:t>
+        <w:t xml:space="preserve"> Ιωάννης </w:t>
       </w:r>
     </w:p>
     <w:p>
@@ -304,26 +289,12 @@
         <w:rPr>
           <w:rFonts w:ascii="Calibri" w:hAnsi="Calibri" w:cs="Calibri"/>
         </w:rPr>
-        <w:t>Βουγιουκλής Ξέρξης – Εμμανουήλ</w:t>
-      </w:r>
-    </w:p>
-    <w:p>
-      <w:pPr>
-        <w:ind w:left="730"/>
-        <w:rPr>
-          <w:rFonts w:ascii="Calibri" w:hAnsi="Calibri" w:cs="Calibri"/>
-        </w:rPr>
-      </w:pPr>
-      <w:r>
-        <w:rPr>
-          <w:rFonts w:ascii="Calibri" w:hAnsi="Calibri" w:cs="Calibri"/>
-        </w:rPr>
-        <w:t>ΑΜ: 1084507</w:t>
-      </w:r>
-    </w:p>
-    <w:p>
-      <w:pPr>
-        <w:spacing w:after="86"/>
+        <w:t>ΑΜ: 1084531</w:t>
+      </w:r>
+    </w:p>
+    <w:p>
+      <w:pPr>
+        <w:spacing w:after="87"/>
         <w:ind w:left="730"/>
         <w:rPr>
           <w:rFonts w:ascii="Calibri" w:hAnsi="Calibri" w:cs="Calibri"/>
@@ -347,19 +318,11 @@
           <w:rFonts w:ascii="Calibri" w:hAnsi="Calibri" w:cs="Calibri"/>
         </w:rPr>
       </w:pPr>
-      <w:proofErr w:type="spellStart"/>
-      <w:r>
-        <w:rPr>
-          <w:rFonts w:ascii="Calibri" w:hAnsi="Calibri" w:cs="Calibri"/>
-        </w:rPr>
-        <w:t>Γερόλυμος</w:t>
-      </w:r>
-      <w:proofErr w:type="spellEnd"/>
-      <w:r>
-        <w:rPr>
-          <w:rFonts w:ascii="Calibri" w:hAnsi="Calibri" w:cs="Calibri"/>
-        </w:rPr>
-        <w:t xml:space="preserve"> Γεράσιμος</w:t>
+      <w:r>
+        <w:rPr>
+          <w:rFonts w:ascii="Calibri" w:hAnsi="Calibri" w:cs="Calibri"/>
+        </w:rPr>
+        <w:t>Βουγιουκλής Ξέρξης – Εμμανουήλ</w:t>
       </w:r>
     </w:p>
     <w:p>
@@ -373,12 +336,12 @@
         <w:rPr>
           <w:rFonts w:ascii="Calibri" w:hAnsi="Calibri" w:cs="Calibri"/>
         </w:rPr>
-        <w:t>ΑΜ: /</w:t>
-      </w:r>
-    </w:p>
-    <w:p>
-      <w:pPr>
-        <w:spacing w:after="87"/>
+        <w:t>ΑΜ: 1084507</w:t>
+      </w:r>
+    </w:p>
+    <w:p>
+      <w:pPr>
+        <w:spacing w:after="86"/>
         <w:ind w:left="730"/>
         <w:rPr>
           <w:rFonts w:ascii="Calibri" w:hAnsi="Calibri" w:cs="Calibri"/>
@@ -388,7 +351,7 @@
         <w:rPr>
           <w:rFonts w:ascii="Calibri" w:hAnsi="Calibri" w:cs="Calibri"/>
         </w:rPr>
-        <w:t>Έτος: /</w:t>
+        <w:t>Έτος: 5ο</w:t>
       </w:r>
     </w:p>
     <w:p>
@@ -407,14 +370,14 @@
         <w:rPr>
           <w:rFonts w:ascii="Calibri" w:hAnsi="Calibri" w:cs="Calibri"/>
         </w:rPr>
-        <w:t>Σπηλιωτακόπουλος</w:t>
+        <w:t>Γερόλυμος</w:t>
       </w:r>
       <w:proofErr w:type="spellEnd"/>
       <w:r>
         <w:rPr>
           <w:rFonts w:ascii="Calibri" w:hAnsi="Calibri" w:cs="Calibri"/>
         </w:rPr>
-        <w:t xml:space="preserve"> Αθανάσιος</w:t>
+        <w:t xml:space="preserve"> Γεράσιμος</w:t>
       </w:r>
     </w:p>
     <w:p>
@@ -422,13 +385,21 @@
         <w:ind w:left="730"/>
         <w:rPr>
           <w:rFonts w:ascii="Calibri" w:hAnsi="Calibri" w:cs="Calibri"/>
-        </w:rPr>
-      </w:pPr>
-      <w:r>
-        <w:rPr>
-          <w:rFonts w:ascii="Calibri" w:hAnsi="Calibri" w:cs="Calibri"/>
-        </w:rPr>
-        <w:t>ΑΜ: 1041885</w:t>
+          <w:lang w:val="en-GB"/>
+        </w:rPr>
+      </w:pPr>
+      <w:r>
+        <w:rPr>
+          <w:rFonts w:ascii="Calibri" w:hAnsi="Calibri" w:cs="Calibri"/>
+        </w:rPr>
+        <w:t xml:space="preserve">ΑΜ: </w:t>
+      </w:r>
+      <w:r>
+        <w:rPr>
+          <w:rFonts w:ascii="Calibri" w:hAnsi="Calibri" w:cs="Calibri"/>
+          <w:lang w:val="en-GB"/>
+        </w:rPr>
+        <w:t>1091848</w:t>
       </w:r>
     </w:p>
     <w:p>
@@ -437,13 +408,21 @@
         <w:ind w:left="730"/>
         <w:rPr>
           <w:rFonts w:ascii="Calibri" w:hAnsi="Calibri" w:cs="Calibri"/>
-        </w:rPr>
-      </w:pPr>
-      <w:r>
-        <w:rPr>
-          <w:rFonts w:ascii="Calibri" w:hAnsi="Calibri" w:cs="Calibri"/>
-        </w:rPr>
-        <w:t>Έτος: 11o</w:t>
+          <w:lang w:val="en-GB"/>
+        </w:rPr>
+      </w:pPr>
+      <w:r>
+        <w:rPr>
+          <w:rFonts w:ascii="Calibri" w:hAnsi="Calibri" w:cs="Calibri"/>
+        </w:rPr>
+        <w:t xml:space="preserve">Έτος: </w:t>
+      </w:r>
+      <w:r>
+        <w:rPr>
+          <w:rFonts w:ascii="Calibri" w:hAnsi="Calibri" w:cs="Calibri"/>
+          <w:lang w:val="en-GB"/>
+        </w:rPr>
+        <w:t>4o</w:t>
       </w:r>
     </w:p>
     <w:p>
@@ -457,6 +436,61 @@
           <w:rFonts w:ascii="Calibri" w:hAnsi="Calibri" w:cs="Calibri"/>
         </w:rPr>
       </w:pPr>
+      <w:proofErr w:type="spellStart"/>
+      <w:r>
+        <w:rPr>
+          <w:rFonts w:ascii="Calibri" w:hAnsi="Calibri" w:cs="Calibri"/>
+        </w:rPr>
+        <w:t>Σπηλιωτακόπουλος</w:t>
+      </w:r>
+      <w:proofErr w:type="spellEnd"/>
+      <w:r>
+        <w:rPr>
+          <w:rFonts w:ascii="Calibri" w:hAnsi="Calibri" w:cs="Calibri"/>
+        </w:rPr>
+        <w:t xml:space="preserve"> Αθανάσιος</w:t>
+      </w:r>
+    </w:p>
+    <w:p>
+      <w:pPr>
+        <w:ind w:left="730"/>
+        <w:rPr>
+          <w:rFonts w:ascii="Calibri" w:hAnsi="Calibri" w:cs="Calibri"/>
+        </w:rPr>
+      </w:pPr>
+      <w:r>
+        <w:rPr>
+          <w:rFonts w:ascii="Calibri" w:hAnsi="Calibri" w:cs="Calibri"/>
+        </w:rPr>
+        <w:t>ΑΜ: 1041885</w:t>
+      </w:r>
+    </w:p>
+    <w:p>
+      <w:pPr>
+        <w:spacing w:after="87"/>
+        <w:ind w:left="730"/>
+        <w:rPr>
+          <w:rFonts w:ascii="Calibri" w:hAnsi="Calibri" w:cs="Calibri"/>
+        </w:rPr>
+      </w:pPr>
+      <w:r>
+        <w:rPr>
+          <w:rFonts w:ascii="Calibri" w:hAnsi="Calibri" w:cs="Calibri"/>
+        </w:rPr>
+        <w:t>Έτος: 11o</w:t>
+      </w:r>
+    </w:p>
+    <w:p>
+      <w:pPr>
+        <w:numPr>
+          <w:ilvl w:val="0"/>
+          <w:numId w:val="1"/>
+        </w:numPr>
+        <w:ind w:hanging="360"/>
+        <w:rPr>
+          <w:rFonts w:ascii="Calibri" w:hAnsi="Calibri" w:cs="Calibri"/>
+        </w:rPr>
+      </w:pPr>
       <w:r>
         <w:rPr>
           <w:rFonts w:ascii="Calibri" w:hAnsi="Calibri" w:cs="Calibri"/>
@@ -504,67 +538,105 @@
     </w:p>
     <w:p>
       <w:pPr>
+        <w:rPr>
+          <w:rFonts w:ascii="Calibri" w:hAnsi="Calibri" w:cs="Calibri"/>
+        </w:rPr>
+      </w:pPr>
+      <w:proofErr w:type="spellStart"/>
+      <w:r>
+        <w:rPr>
+          <w:rFonts w:ascii="Calibri" w:hAnsi="Calibri" w:cs="Calibri"/>
+        </w:rPr>
+        <w:t>Author</w:t>
+      </w:r>
+      <w:proofErr w:type="spellEnd"/>
+      <w:r>
+        <w:rPr>
+          <w:rFonts w:ascii="Calibri" w:hAnsi="Calibri" w:cs="Calibri"/>
+          <w:lang w:val="en-GB"/>
+        </w:rPr>
+        <w:t>s</w:t>
+      </w:r>
+      <w:r>
+        <w:rPr>
+          <w:rFonts w:ascii="Calibri" w:hAnsi="Calibri" w:cs="Calibri"/>
+        </w:rPr>
+        <w:t xml:space="preserve">: </w:t>
+      </w:r>
+      <w:r>
+        <w:rPr>
+          <w:rFonts w:ascii="Calibri" w:hAnsi="Calibri" w:cs="Calibri"/>
+        </w:rPr>
+        <w:t xml:space="preserve">Τσούλης Αθανάσιος-Ανδρέας, </w:t>
+      </w:r>
+      <w:proofErr w:type="spellStart"/>
+      <w:r>
+        <w:rPr>
+          <w:rFonts w:ascii="Calibri" w:hAnsi="Calibri" w:cs="Calibri"/>
+        </w:rPr>
+        <w:t>Γερόλυμος</w:t>
+      </w:r>
+      <w:proofErr w:type="spellEnd"/>
+      <w:r>
+        <w:rPr>
+          <w:rFonts w:ascii="Calibri" w:hAnsi="Calibri" w:cs="Calibri"/>
+        </w:rPr>
+        <w:t xml:space="preserve"> Γεράσιμος</w:t>
+      </w:r>
+    </w:p>
+    <w:p>
+      <w:pPr>
         <w:ind w:left="-5" w:right="5126"/>
         <w:rPr>
           <w:rFonts w:ascii="Calibri" w:hAnsi="Calibri" w:cs="Calibri"/>
           <w:lang w:val="en-GB"/>
         </w:rPr>
       </w:pPr>
-      <w:proofErr w:type="spellStart"/>
-      <w:r>
-        <w:rPr>
-          <w:rFonts w:ascii="Calibri" w:hAnsi="Calibri" w:cs="Calibri"/>
-        </w:rPr>
-        <w:t>Author</w:t>
-      </w:r>
-      <w:proofErr w:type="spellEnd"/>
-      <w:r>
-        <w:rPr>
-          <w:rFonts w:ascii="Calibri" w:hAnsi="Calibri" w:cs="Calibri"/>
-        </w:rPr>
-        <w:t xml:space="preserve">: </w:t>
-      </w:r>
-      <w:proofErr w:type="spellStart"/>
-      <w:r>
-        <w:rPr>
-          <w:rFonts w:ascii="Calibri" w:hAnsi="Calibri" w:cs="Calibri"/>
-        </w:rPr>
-        <w:t>Σπηλιωτακόπουλος</w:t>
-      </w:r>
-      <w:proofErr w:type="spellEnd"/>
-      <w:r>
-        <w:rPr>
-          <w:rFonts w:ascii="Calibri" w:hAnsi="Calibri" w:cs="Calibri"/>
-        </w:rPr>
-        <w:t xml:space="preserve"> Αθανάσιος </w:t>
-      </w:r>
-      <w:proofErr w:type="spellStart"/>
-      <w:r>
-        <w:rPr>
-          <w:rFonts w:ascii="Calibri" w:hAnsi="Calibri" w:cs="Calibri"/>
-        </w:rPr>
-        <w:t>Editor</w:t>
-      </w:r>
-      <w:proofErr w:type="spellEnd"/>
-      <w:r>
-        <w:rPr>
-          <w:rFonts w:ascii="Calibri" w:hAnsi="Calibri" w:cs="Calibri"/>
-        </w:rPr>
-        <w:t xml:space="preserve">: Βουγιουκλής Ξέρξης – Εμμανουήλ </w:t>
-      </w:r>
-      <w:proofErr w:type="spellStart"/>
-      <w:r>
-        <w:rPr>
-          <w:rFonts w:ascii="Calibri" w:hAnsi="Calibri" w:cs="Calibri"/>
-        </w:rPr>
-        <w:t>Graphics</w:t>
-      </w:r>
-      <w:proofErr w:type="spellEnd"/>
-      <w:r>
-        <w:rPr>
-          <w:rFonts w:ascii="Calibri" w:hAnsi="Calibri" w:cs="Calibri"/>
-        </w:rPr>
-        <w:t>:</w:t>
+      <w:r>
+        <w:rPr>
+          <w:rFonts w:ascii="Calibri" w:hAnsi="Calibri" w:cs="Calibri"/>
+          <w:lang w:val="en-GB"/>
+        </w:rPr>
+        <w:t xml:space="preserve">Editor: </w:t>
+      </w:r>
+      <w:r>
+        <w:rPr>
+          <w:rFonts w:ascii="Calibri" w:hAnsi="Calibri" w:cs="Calibri"/>
+        </w:rPr>
+        <w:t>Βουγιουκλής</w:t>
+      </w:r>
+      <w:r>
+        <w:rPr>
+          <w:rFonts w:ascii="Calibri" w:hAnsi="Calibri" w:cs="Calibri"/>
+          <w:lang w:val="en-GB"/>
+        </w:rPr>
+        <w:t xml:space="preserve"> </w:t>
+      </w:r>
+      <w:r>
+        <w:rPr>
+          <w:rFonts w:ascii="Calibri" w:hAnsi="Calibri" w:cs="Calibri"/>
+        </w:rPr>
+        <w:t>Ξέρξης</w:t>
+      </w:r>
+      <w:r>
+        <w:rPr>
+          <w:rFonts w:ascii="Calibri" w:hAnsi="Calibri" w:cs="Calibri"/>
+          <w:lang w:val="en-GB"/>
+        </w:rPr>
+        <w:t xml:space="preserve"> – </w:t>
+      </w:r>
+      <w:r>
+        <w:rPr>
+          <w:rFonts w:ascii="Calibri" w:hAnsi="Calibri" w:cs="Calibri"/>
+        </w:rPr>
+        <w:t>Εμμανουήλ</w:t>
+      </w:r>
+      <w:r>
+        <w:rPr>
+          <w:rFonts w:ascii="Calibri" w:hAnsi="Calibri" w:cs="Calibri"/>
+          <w:lang w:val="en-GB"/>
+        </w:rPr>
+        <w:t xml:space="preserve"> </w:t>
       </w:r>
     </w:p>
     <w:p>
@@ -725,6 +797,7 @@
         <w:ind w:left="0" w:right="5126" w:firstLine="0"/>
         <w:rPr>
           <w:rFonts w:ascii="Calibri" w:hAnsi="Calibri" w:cs="Calibri"/>
+          <w:lang w:val="en-GB"/>
         </w:rPr>
       </w:pPr>
     </w:p>
@@ -745,7 +818,6 @@
           <w:bCs/>
           <w:sz w:val="36"/>
           <w:szCs w:val="36"/>
-          <w:lang w:val="en-GB"/>
         </w:rPr>
       </w:pPr>
       <w:r>
@@ -758,192 +830,19 @@
           <w:lang w:val="en-GB"/>
         </w:rPr>
         <w:lastRenderedPageBreak/>
-        <w:t>Domain Model</w:t>
-      </w:r>
-    </w:p>
-    <w:p>
-      <w:pPr>
-        <w:rPr>
-          <w:rFonts w:ascii="Calibri" w:hAnsi="Calibri" w:cs="Calibri"/>
-        </w:rPr>
-      </w:pPr>
-      <w:r>
-        <w:rPr>
-          <w:rFonts w:ascii="Calibri" w:hAnsi="Calibri" w:cs="Calibri"/>
-        </w:rPr>
-        <w:t>Η δημιουργία του</w:t>
-      </w:r>
-      <w:r>
-        <w:rPr>
-          <w:rFonts w:ascii="Calibri" w:hAnsi="Calibri" w:cs="Calibri"/>
-        </w:rPr>
-        <w:t xml:space="preserve"> διαγράμματος έγινε με το εργαλείο </w:t>
-      </w:r>
-      <w:r>
-        <w:rPr>
-          <w:rFonts w:ascii="Calibri" w:hAnsi="Calibri" w:cs="Calibri"/>
-          <w:lang w:val="en-GB"/>
-        </w:rPr>
-        <w:t>draw</w:t>
-      </w:r>
-      <w:r>
-        <w:rPr>
-          <w:rFonts w:ascii="Calibri" w:hAnsi="Calibri" w:cs="Calibri"/>
-        </w:rPr>
-        <w:t>.</w:t>
-      </w:r>
-      <w:r>
-        <w:rPr>
-          <w:rFonts w:ascii="Calibri" w:hAnsi="Calibri" w:cs="Calibri"/>
-          <w:lang w:val="en-GB"/>
-        </w:rPr>
-        <w:t>io</w:t>
-      </w:r>
-      <w:r>
-        <w:rPr>
-          <w:rFonts w:ascii="Calibri" w:hAnsi="Calibri" w:cs="Calibri"/>
-        </w:rPr>
-        <w:t>. Στην παρούσα έκδοση (</w:t>
-      </w:r>
-      <w:r>
-        <w:rPr>
-          <w:rFonts w:ascii="Calibri" w:hAnsi="Calibri" w:cs="Calibri"/>
-          <w:lang w:val="en-GB"/>
-        </w:rPr>
-        <w:t>v</w:t>
-      </w:r>
-      <w:r>
-        <w:rPr>
-          <w:rFonts w:ascii="Calibri" w:hAnsi="Calibri" w:cs="Calibri"/>
-        </w:rPr>
-        <w:t>0.1)</w:t>
-      </w:r>
-      <w:r>
-        <w:rPr>
-          <w:rFonts w:ascii="Calibri" w:hAnsi="Calibri" w:cs="Calibri"/>
-        </w:rPr>
-        <w:t xml:space="preserve"> προστέθηκαν τα ονόματα των κλάσεων όπως προέκυψαν από την περιγραφή της εφαρμογής, οι σχέσεις (</w:t>
-      </w:r>
-      <w:r>
-        <w:rPr>
-          <w:rFonts w:ascii="Calibri" w:hAnsi="Calibri" w:cs="Calibri"/>
-          <w:lang w:val="en-GB"/>
-        </w:rPr>
-        <w:t>relations</w:t>
-      </w:r>
-      <w:r>
-        <w:rPr>
-          <w:rFonts w:ascii="Calibri" w:hAnsi="Calibri" w:cs="Calibri"/>
-        </w:rPr>
-        <w:t xml:space="preserve">) </w:t>
-      </w:r>
-      <w:r>
-        <w:rPr>
-          <w:rFonts w:ascii="Calibri" w:hAnsi="Calibri" w:cs="Calibri"/>
-        </w:rPr>
-        <w:t xml:space="preserve">μεταξύ τους καθώς και τα </w:t>
-      </w:r>
-      <w:r>
-        <w:rPr>
-          <w:rFonts w:ascii="Calibri" w:hAnsi="Calibri" w:cs="Calibri"/>
-          <w:lang w:val="en-GB"/>
-        </w:rPr>
-        <w:t>multiplicities</w:t>
-      </w:r>
-      <w:r>
-        <w:rPr>
-          <w:rFonts w:ascii="Calibri" w:hAnsi="Calibri" w:cs="Calibri"/>
-        </w:rPr>
-        <w:t>.</w:t>
-      </w:r>
-      <w:r>
-        <w:rPr>
-          <w:rFonts w:ascii="Calibri" w:hAnsi="Calibri" w:cs="Calibri"/>
-        </w:rPr>
-        <w:t xml:space="preserve"> </w:t>
-      </w:r>
-      <w:r>
-        <w:rPr>
-          <w:rFonts w:ascii="Calibri" w:hAnsi="Calibri" w:cs="Calibri"/>
-        </w:rPr>
-        <w:t xml:space="preserve">Η σχεδίαση προσπαθήσαμε, όσο είναι εφικτό, να ακολουθεί την </w:t>
-      </w:r>
-      <w:proofErr w:type="spellStart"/>
-      <w:r>
-        <w:rPr>
-          <w:rFonts w:ascii="Calibri" w:hAnsi="Calibri" w:cs="Calibri"/>
-        </w:rPr>
-        <w:t>οντοκεντρική</w:t>
-      </w:r>
-      <w:proofErr w:type="spellEnd"/>
-      <w:r>
-        <w:rPr>
-          <w:rFonts w:ascii="Calibri" w:hAnsi="Calibri" w:cs="Calibri"/>
-        </w:rPr>
-        <w:t xml:space="preserve"> φιλοσοφία και τις πρακτικές.</w:t>
-      </w:r>
-    </w:p>
-    <w:p>
-      <w:pPr>
-        <w:rPr>
-          <w:rFonts w:ascii="Calibri" w:hAnsi="Calibri" w:cs="Calibri"/>
-        </w:rPr>
-      </w:pPr>
-      <w:r>
-        <w:rPr>
-          <w:rFonts w:ascii="Calibri" w:hAnsi="Calibri" w:cs="Calibri"/>
-        </w:rPr>
-        <w:t xml:space="preserve">Αναφέρουμε πως οι μέθοδοι και τα </w:t>
-      </w:r>
-      <w:r>
-        <w:rPr>
-          <w:rFonts w:ascii="Calibri" w:hAnsi="Calibri" w:cs="Calibri"/>
-          <w:lang w:val="en-GB"/>
-        </w:rPr>
-        <w:t>instance</w:t>
-      </w:r>
-      <w:r>
-        <w:rPr>
-          <w:rFonts w:ascii="Calibri" w:hAnsi="Calibri" w:cs="Calibri"/>
-        </w:rPr>
-        <w:t xml:space="preserve"> </w:t>
-      </w:r>
-      <w:r>
-        <w:rPr>
-          <w:rFonts w:ascii="Calibri" w:hAnsi="Calibri" w:cs="Calibri"/>
-          <w:lang w:val="en-GB"/>
-        </w:rPr>
-        <w:t>variables</w:t>
-      </w:r>
-      <w:r>
-        <w:rPr>
-          <w:rFonts w:ascii="Calibri" w:hAnsi="Calibri" w:cs="Calibri"/>
-        </w:rPr>
-        <w:t xml:space="preserve"> </w:t>
-      </w:r>
-      <w:r>
-        <w:rPr>
-          <w:rFonts w:ascii="Calibri" w:hAnsi="Calibri" w:cs="Calibri"/>
-        </w:rPr>
-        <w:t xml:space="preserve">της κάθε κλάσης θα προστεθούν σε μεταγενέστερη έκδοση. </w:t>
-      </w:r>
-    </w:p>
-    <w:p>
-      <w:pPr>
-        <w:ind w:left="-5" w:right="5126"/>
+        <w:t>Domain</w:t>
+      </w:r>
+      <w:r>
         <w:rPr>
           <w:rFonts w:ascii="Calibri" w:hAnsi="Calibri" w:cs="Calibri"/>
           <w:b/>
           <w:bCs/>
           <w:sz w:val="36"/>
           <w:szCs w:val="36"/>
-          <w:lang w:val="en-GB"/>
-        </w:rPr>
-      </w:pPr>
-    </w:p>
-    <w:p>
-      <w:pPr>
-        <w:ind w:left="-5" w:right="5126"/>
+        </w:rPr>
+        <w:t xml:space="preserve"> </w:t>
+      </w:r>
+      <w:r>
         <w:rPr>
           <w:rFonts w:ascii="Calibri" w:hAnsi="Calibri" w:cs="Calibri"/>
           <w:b/>
@@ -952,7 +851,175 @@
           <w:szCs w:val="36"/>
           <w:lang w:val="en-GB"/>
         </w:rPr>
-      </w:pPr>
+        <w:t>Model</w:t>
+      </w:r>
+    </w:p>
+    <w:p>
+      <w:pPr>
+        <w:rPr>
+          <w:rFonts w:ascii="Calibri" w:hAnsi="Calibri" w:cs="Calibri"/>
+        </w:rPr>
+      </w:pPr>
+      <w:r>
+        <w:rPr>
+          <w:rFonts w:ascii="Calibri" w:hAnsi="Calibri" w:cs="Calibri"/>
+        </w:rPr>
+        <w:t>Η δημιουργία του</w:t>
+      </w:r>
+      <w:r>
+        <w:rPr>
+          <w:rFonts w:ascii="Calibri" w:hAnsi="Calibri" w:cs="Calibri"/>
+        </w:rPr>
+        <w:t xml:space="preserve"> διαγράμματος έγινε με το εργαλείο </w:t>
+      </w:r>
+      <w:r>
+        <w:rPr>
+          <w:rFonts w:ascii="Calibri" w:hAnsi="Calibri" w:cs="Calibri"/>
+          <w:lang w:val="en-GB"/>
+        </w:rPr>
+        <w:t>draw</w:t>
+      </w:r>
+      <w:r>
+        <w:rPr>
+          <w:rFonts w:ascii="Calibri" w:hAnsi="Calibri" w:cs="Calibri"/>
+        </w:rPr>
+        <w:t>.</w:t>
+      </w:r>
+      <w:r>
+        <w:rPr>
+          <w:rFonts w:ascii="Calibri" w:hAnsi="Calibri" w:cs="Calibri"/>
+          <w:lang w:val="en-GB"/>
+        </w:rPr>
+        <w:t>io</w:t>
+      </w:r>
+      <w:r>
+        <w:rPr>
+          <w:rFonts w:ascii="Calibri" w:hAnsi="Calibri" w:cs="Calibri"/>
+        </w:rPr>
+        <w:t>. Στην παρούσα έκδοση (</w:t>
+      </w:r>
+      <w:r>
+        <w:rPr>
+          <w:rFonts w:ascii="Calibri" w:hAnsi="Calibri" w:cs="Calibri"/>
+          <w:lang w:val="en-GB"/>
+        </w:rPr>
+        <w:t>v</w:t>
+      </w:r>
+      <w:r>
+        <w:rPr>
+          <w:rFonts w:ascii="Calibri" w:hAnsi="Calibri" w:cs="Calibri"/>
+        </w:rPr>
+        <w:t>0.1)</w:t>
+      </w:r>
+      <w:r>
+        <w:rPr>
+          <w:rFonts w:ascii="Calibri" w:hAnsi="Calibri" w:cs="Calibri"/>
+        </w:rPr>
+        <w:t xml:space="preserve"> προστέθηκαν τα ονόματα των κλάσεων όπως προέκυψαν από την περιγραφή της εφαρμογής, οι σχέσεις (</w:t>
+      </w:r>
+      <w:r>
+        <w:rPr>
+          <w:rFonts w:ascii="Calibri" w:hAnsi="Calibri" w:cs="Calibri"/>
+          <w:lang w:val="en-GB"/>
+        </w:rPr>
+        <w:t>relations</w:t>
+      </w:r>
+      <w:r>
+        <w:rPr>
+          <w:rFonts w:ascii="Calibri" w:hAnsi="Calibri" w:cs="Calibri"/>
+        </w:rPr>
+        <w:t xml:space="preserve">) </w:t>
+      </w:r>
+      <w:r>
+        <w:rPr>
+          <w:rFonts w:ascii="Calibri" w:hAnsi="Calibri" w:cs="Calibri"/>
+        </w:rPr>
+        <w:t xml:space="preserve">μεταξύ τους καθώς και τα </w:t>
+      </w:r>
+      <w:r>
+        <w:rPr>
+          <w:rFonts w:ascii="Calibri" w:hAnsi="Calibri" w:cs="Calibri"/>
+          <w:lang w:val="en-GB"/>
+        </w:rPr>
+        <w:t>multiplicities</w:t>
+      </w:r>
+      <w:r>
+        <w:rPr>
+          <w:rFonts w:ascii="Calibri" w:hAnsi="Calibri" w:cs="Calibri"/>
+        </w:rPr>
+        <w:t>.</w:t>
+      </w:r>
+      <w:r>
+        <w:rPr>
+          <w:rFonts w:ascii="Calibri" w:hAnsi="Calibri" w:cs="Calibri"/>
+        </w:rPr>
+        <w:t xml:space="preserve"> </w:t>
+      </w:r>
+      <w:r>
+        <w:rPr>
+          <w:rFonts w:ascii="Calibri" w:hAnsi="Calibri" w:cs="Calibri"/>
+        </w:rPr>
+        <w:t xml:space="preserve">Η σχεδίαση προσπαθήσαμε, όσο είναι εφικτό, να ακολουθεί την </w:t>
+      </w:r>
+      <w:proofErr w:type="spellStart"/>
+      <w:r>
+        <w:rPr>
+          <w:rFonts w:ascii="Calibri" w:hAnsi="Calibri" w:cs="Calibri"/>
+        </w:rPr>
+        <w:t>οντοκεντρική</w:t>
+      </w:r>
+      <w:proofErr w:type="spellEnd"/>
+      <w:r>
+        <w:rPr>
+          <w:rFonts w:ascii="Calibri" w:hAnsi="Calibri" w:cs="Calibri"/>
+        </w:rPr>
+        <w:t xml:space="preserve"> φιλοσοφία και τις πρακτικές.</w:t>
+      </w:r>
+    </w:p>
+    <w:p>
+      <w:pPr>
+        <w:rPr>
+          <w:rFonts w:ascii="Calibri" w:hAnsi="Calibri" w:cs="Calibri"/>
+        </w:rPr>
+      </w:pPr>
+      <w:r>
+        <w:rPr>
+          <w:rFonts w:ascii="Calibri" w:hAnsi="Calibri" w:cs="Calibri"/>
+        </w:rPr>
+        <w:t xml:space="preserve">Αναφέρουμε πως οι μέθοδοι και τα </w:t>
+      </w:r>
+      <w:r>
+        <w:rPr>
+          <w:rFonts w:ascii="Calibri" w:hAnsi="Calibri" w:cs="Calibri"/>
+          <w:lang w:val="en-GB"/>
+        </w:rPr>
+        <w:t>instance</w:t>
+      </w:r>
+      <w:r>
+        <w:rPr>
+          <w:rFonts w:ascii="Calibri" w:hAnsi="Calibri" w:cs="Calibri"/>
+        </w:rPr>
+        <w:t xml:space="preserve"> </w:t>
+      </w:r>
+      <w:r>
+        <w:rPr>
+          <w:rFonts w:ascii="Calibri" w:hAnsi="Calibri" w:cs="Calibri"/>
+          <w:lang w:val="en-GB"/>
+        </w:rPr>
+        <w:t>variables</w:t>
+      </w:r>
+      <w:r>
+        <w:rPr>
+          <w:rFonts w:ascii="Calibri" w:hAnsi="Calibri" w:cs="Calibri"/>
+        </w:rPr>
+        <w:t xml:space="preserve"> </w:t>
+      </w:r>
+      <w:r>
+        <w:rPr>
+          <w:rFonts w:ascii="Calibri" w:hAnsi="Calibri" w:cs="Calibri"/>
+        </w:rPr>
+        <w:t xml:space="preserve">της κάθε κλάσης θα προστεθούν σε μεταγενέστερη έκδοση. </w:t>
+      </w:r>
     </w:p>
     <w:p>
       <w:pPr>
@@ -963,10 +1030,12 @@
           <w:bCs/>
           <w:sz w:val="36"/>
           <w:szCs w:val="36"/>
-          <w:lang w:val="en-GB"/>
-        </w:rPr>
-      </w:pPr>
-      <w:r>
+        </w:rPr>
+      </w:pPr>
+    </w:p>
+    <w:p>
+      <w:pPr>
+        <w:ind w:left="-5" w:right="5126"/>
         <w:rPr>
           <w:rFonts w:ascii="Calibri" w:hAnsi="Calibri" w:cs="Calibri"/>
           <w:b/>
@@ -974,8 +1043,7 @@
           <w:sz w:val="36"/>
           <w:szCs w:val="36"/>
         </w:rPr>
-        <w:t>Διάγραμμα</w:t>
-      </w:r>
+      </w:pPr>
     </w:p>
     <w:p>
       <w:pPr>
@@ -986,7 +1054,28 @@
           <w:bCs/>
           <w:sz w:val="36"/>
           <w:szCs w:val="36"/>
-          <w:lang w:val="en-GB"/>
+        </w:rPr>
+      </w:pPr>
+      <w:r>
+        <w:rPr>
+          <w:rFonts w:ascii="Calibri" w:hAnsi="Calibri" w:cs="Calibri"/>
+          <w:b/>
+          <w:bCs/>
+          <w:sz w:val="36"/>
+          <w:szCs w:val="36"/>
+        </w:rPr>
+        <w:t>Διάγραμμα</w:t>
+      </w:r>
+    </w:p>
+    <w:p>
+      <w:pPr>
+        <w:ind w:left="-5" w:right="5126"/>
+        <w:rPr>
+          <w:rFonts w:ascii="Calibri" w:hAnsi="Calibri" w:cs="Calibri"/>
+          <w:b/>
+          <w:bCs/>
+          <w:sz w:val="36"/>
+          <w:szCs w:val="36"/>
         </w:rPr>
       </w:pPr>
       <w:r>
@@ -1072,7 +1161,6 @@
           <w:bCs/>
           <w:sz w:val="36"/>
           <w:szCs w:val="36"/>
-          <w:lang w:val="en-GB"/>
         </w:rPr>
       </w:pPr>
     </w:p>
@@ -1085,7 +1173,6 @@
           <w:bCs/>
           <w:sz w:val="36"/>
           <w:szCs w:val="36"/>
-          <w:lang w:val="en-GB"/>
         </w:rPr>
       </w:pPr>
     </w:p>
@@ -1098,7 +1185,6 @@
           <w:bCs/>
           <w:sz w:val="36"/>
           <w:szCs w:val="36"/>
-          <w:lang w:val="en-GB"/>
         </w:rPr>
       </w:pPr>
     </w:p>
@@ -1111,7 +1197,6 @@
           <w:bCs/>
           <w:sz w:val="36"/>
           <w:szCs w:val="36"/>
-          <w:lang w:val="en-GB"/>
         </w:rPr>
       </w:pPr>
     </w:p>
@@ -1124,7 +1209,6 @@
           <w:bCs/>
           <w:sz w:val="36"/>
           <w:szCs w:val="36"/>
-          <w:lang w:val="en-GB"/>
         </w:rPr>
       </w:pPr>
     </w:p>
@@ -1744,13 +1828,7 @@
         <w:rPr>
           <w:rFonts w:ascii="Calibri" w:hAnsi="Calibri" w:cs="Calibri"/>
         </w:rPr>
-        <w:t>Π</w:t>
-      </w:r>
-      <w:r>
-        <w:rPr>
-          <w:rFonts w:ascii="Calibri" w:hAnsi="Calibri" w:cs="Calibri"/>
-        </w:rPr>
-        <w:t>ληροφορίες του προϊόντος όπως όνομα, κατηγορία (εξοπλισμός γυμναστικής,</w:t>
+        <w:t>Πληροφορίες του προϊόντος όπως όνομα, κατηγορία (εξοπλισμός γυμναστικής,</w:t>
       </w:r>
       <w:r>
         <w:t xml:space="preserve"> συμπληρώματα διατροφής </w:t>
@@ -3288,6 +3366,7 @@
   <w:style w:type="character" w:default="1" w:styleId="DefaultParagraphFont">
     <w:name w:val="Default Paragraph Font"/>
     <w:uiPriority w:val="1"/>
+    <w:semiHidden/>
     <w:unhideWhenUsed/>
   </w:style>
   <w:style w:type="table" w:default="1" w:styleId="TableNormal">

</xml_diff>

<commit_message>
fixed typo, fixed names docx
</commit_message>
<xml_diff>
--- a/documentation/src/domain-model-v0.1.docx
+++ b/documentation/src/domain-model-v0.1.docx
@@ -137,7 +137,7 @@
           <w:sz w:val="32"/>
           <w:lang w:val="en-GB"/>
         </w:rPr>
-        <w:t>domain-model-</w:t>
+        <w:t>domain-model</w:t>
       </w:r>
       <w:r>
         <w:rPr>
@@ -271,22 +271,7 @@
         <w:rPr>
           <w:rFonts w:ascii="Calibri" w:hAnsi="Calibri" w:cs="Calibri"/>
         </w:rPr>
-        <w:t xml:space="preserve"> Ιωάννης ΑΜ: 1084531</w:t>
-      </w:r>
-    </w:p>
-    <w:p>
-      <w:pPr>
-        <w:spacing w:after="87"/>
-        <w:ind w:left="730"/>
-        <w:rPr>
-          <w:rFonts w:ascii="Calibri" w:hAnsi="Calibri" w:cs="Calibri"/>
-        </w:rPr>
-      </w:pPr>
-      <w:r>
-        <w:rPr>
-          <w:rFonts w:ascii="Calibri" w:hAnsi="Calibri" w:cs="Calibri"/>
-        </w:rPr>
-        <w:t>Έτος: 5ο</w:t>
+        <w:t xml:space="preserve"> Ιωάννης </w:t>
       </w:r>
     </w:p>
     <w:p>
@@ -304,26 +289,12 @@
         <w:rPr>
           <w:rFonts w:ascii="Calibri" w:hAnsi="Calibri" w:cs="Calibri"/>
         </w:rPr>
-        <w:t>Βουγιουκλής Ξέρξης – Εμμανουήλ</w:t>
-      </w:r>
-    </w:p>
-    <w:p>
-      <w:pPr>
-        <w:ind w:left="730"/>
-        <w:rPr>
-          <w:rFonts w:ascii="Calibri" w:hAnsi="Calibri" w:cs="Calibri"/>
-        </w:rPr>
-      </w:pPr>
-      <w:r>
-        <w:rPr>
-          <w:rFonts w:ascii="Calibri" w:hAnsi="Calibri" w:cs="Calibri"/>
-        </w:rPr>
-        <w:t>ΑΜ: 1084507</w:t>
-      </w:r>
-    </w:p>
-    <w:p>
-      <w:pPr>
-        <w:spacing w:after="86"/>
+        <w:t>ΑΜ: 1084531</w:t>
+      </w:r>
+    </w:p>
+    <w:p>
+      <w:pPr>
+        <w:spacing w:after="87"/>
         <w:ind w:left="730"/>
         <w:rPr>
           <w:rFonts w:ascii="Calibri" w:hAnsi="Calibri" w:cs="Calibri"/>
@@ -347,19 +318,11 @@
           <w:rFonts w:ascii="Calibri" w:hAnsi="Calibri" w:cs="Calibri"/>
         </w:rPr>
       </w:pPr>
-      <w:proofErr w:type="spellStart"/>
-      <w:r>
-        <w:rPr>
-          <w:rFonts w:ascii="Calibri" w:hAnsi="Calibri" w:cs="Calibri"/>
-        </w:rPr>
-        <w:t>Γερόλυμος</w:t>
-      </w:r>
-      <w:proofErr w:type="spellEnd"/>
-      <w:r>
-        <w:rPr>
-          <w:rFonts w:ascii="Calibri" w:hAnsi="Calibri" w:cs="Calibri"/>
-        </w:rPr>
-        <w:t xml:space="preserve"> Γεράσιμος</w:t>
+      <w:r>
+        <w:rPr>
+          <w:rFonts w:ascii="Calibri" w:hAnsi="Calibri" w:cs="Calibri"/>
+        </w:rPr>
+        <w:t>Βουγιουκλής Ξέρξης – Εμμανουήλ</w:t>
       </w:r>
     </w:p>
     <w:p>
@@ -373,12 +336,12 @@
         <w:rPr>
           <w:rFonts w:ascii="Calibri" w:hAnsi="Calibri" w:cs="Calibri"/>
         </w:rPr>
-        <w:t>ΑΜ: /</w:t>
-      </w:r>
-    </w:p>
-    <w:p>
-      <w:pPr>
-        <w:spacing w:after="87"/>
+        <w:t>ΑΜ: 1084507</w:t>
+      </w:r>
+    </w:p>
+    <w:p>
+      <w:pPr>
+        <w:spacing w:after="86"/>
         <w:ind w:left="730"/>
         <w:rPr>
           <w:rFonts w:ascii="Calibri" w:hAnsi="Calibri" w:cs="Calibri"/>
@@ -388,7 +351,7 @@
         <w:rPr>
           <w:rFonts w:ascii="Calibri" w:hAnsi="Calibri" w:cs="Calibri"/>
         </w:rPr>
-        <w:t>Έτος: /</w:t>
+        <w:t>Έτος: 5ο</w:t>
       </w:r>
     </w:p>
     <w:p>
@@ -407,14 +370,14 @@
         <w:rPr>
           <w:rFonts w:ascii="Calibri" w:hAnsi="Calibri" w:cs="Calibri"/>
         </w:rPr>
-        <w:t>Σπηλιωτακόπουλος</w:t>
+        <w:t>Γερόλυμος</w:t>
       </w:r>
       <w:proofErr w:type="spellEnd"/>
       <w:r>
         <w:rPr>
           <w:rFonts w:ascii="Calibri" w:hAnsi="Calibri" w:cs="Calibri"/>
         </w:rPr>
-        <w:t xml:space="preserve"> Αθανάσιος</w:t>
+        <w:t xml:space="preserve"> Γεράσιμος</w:t>
       </w:r>
     </w:p>
     <w:p>
@@ -422,13 +385,21 @@
         <w:ind w:left="730"/>
         <w:rPr>
           <w:rFonts w:ascii="Calibri" w:hAnsi="Calibri" w:cs="Calibri"/>
-        </w:rPr>
-      </w:pPr>
-      <w:r>
-        <w:rPr>
-          <w:rFonts w:ascii="Calibri" w:hAnsi="Calibri" w:cs="Calibri"/>
-        </w:rPr>
-        <w:t>ΑΜ: 1041885</w:t>
+          <w:lang w:val="en-GB"/>
+        </w:rPr>
+      </w:pPr>
+      <w:r>
+        <w:rPr>
+          <w:rFonts w:ascii="Calibri" w:hAnsi="Calibri" w:cs="Calibri"/>
+        </w:rPr>
+        <w:t xml:space="preserve">ΑΜ: </w:t>
+      </w:r>
+      <w:r>
+        <w:rPr>
+          <w:rFonts w:ascii="Calibri" w:hAnsi="Calibri" w:cs="Calibri"/>
+          <w:lang w:val="en-GB"/>
+        </w:rPr>
+        <w:t>1091848</w:t>
       </w:r>
     </w:p>
     <w:p>
@@ -437,13 +408,21 @@
         <w:ind w:left="730"/>
         <w:rPr>
           <w:rFonts w:ascii="Calibri" w:hAnsi="Calibri" w:cs="Calibri"/>
-        </w:rPr>
-      </w:pPr>
-      <w:r>
-        <w:rPr>
-          <w:rFonts w:ascii="Calibri" w:hAnsi="Calibri" w:cs="Calibri"/>
-        </w:rPr>
-        <w:t>Έτος: 11o</w:t>
+          <w:lang w:val="en-GB"/>
+        </w:rPr>
+      </w:pPr>
+      <w:r>
+        <w:rPr>
+          <w:rFonts w:ascii="Calibri" w:hAnsi="Calibri" w:cs="Calibri"/>
+        </w:rPr>
+        <w:t xml:space="preserve">Έτος: </w:t>
+      </w:r>
+      <w:r>
+        <w:rPr>
+          <w:rFonts w:ascii="Calibri" w:hAnsi="Calibri" w:cs="Calibri"/>
+          <w:lang w:val="en-GB"/>
+        </w:rPr>
+        <w:t>4o</w:t>
       </w:r>
     </w:p>
     <w:p>
@@ -457,6 +436,61 @@
           <w:rFonts w:ascii="Calibri" w:hAnsi="Calibri" w:cs="Calibri"/>
         </w:rPr>
       </w:pPr>
+      <w:proofErr w:type="spellStart"/>
+      <w:r>
+        <w:rPr>
+          <w:rFonts w:ascii="Calibri" w:hAnsi="Calibri" w:cs="Calibri"/>
+        </w:rPr>
+        <w:t>Σπηλιωτακόπουλος</w:t>
+      </w:r>
+      <w:proofErr w:type="spellEnd"/>
+      <w:r>
+        <w:rPr>
+          <w:rFonts w:ascii="Calibri" w:hAnsi="Calibri" w:cs="Calibri"/>
+        </w:rPr>
+        <w:t xml:space="preserve"> Αθανάσιος</w:t>
+      </w:r>
+    </w:p>
+    <w:p>
+      <w:pPr>
+        <w:ind w:left="730"/>
+        <w:rPr>
+          <w:rFonts w:ascii="Calibri" w:hAnsi="Calibri" w:cs="Calibri"/>
+        </w:rPr>
+      </w:pPr>
+      <w:r>
+        <w:rPr>
+          <w:rFonts w:ascii="Calibri" w:hAnsi="Calibri" w:cs="Calibri"/>
+        </w:rPr>
+        <w:t>ΑΜ: 1041885</w:t>
+      </w:r>
+    </w:p>
+    <w:p>
+      <w:pPr>
+        <w:spacing w:after="87"/>
+        <w:ind w:left="730"/>
+        <w:rPr>
+          <w:rFonts w:ascii="Calibri" w:hAnsi="Calibri" w:cs="Calibri"/>
+        </w:rPr>
+      </w:pPr>
+      <w:r>
+        <w:rPr>
+          <w:rFonts w:ascii="Calibri" w:hAnsi="Calibri" w:cs="Calibri"/>
+        </w:rPr>
+        <w:t>Έτος: 11o</w:t>
+      </w:r>
+    </w:p>
+    <w:p>
+      <w:pPr>
+        <w:numPr>
+          <w:ilvl w:val="0"/>
+          <w:numId w:val="1"/>
+        </w:numPr>
+        <w:ind w:hanging="360"/>
+        <w:rPr>
+          <w:rFonts w:ascii="Calibri" w:hAnsi="Calibri" w:cs="Calibri"/>
+        </w:rPr>
+      </w:pPr>
       <w:r>
         <w:rPr>
           <w:rFonts w:ascii="Calibri" w:hAnsi="Calibri" w:cs="Calibri"/>
@@ -504,67 +538,105 @@
     </w:p>
     <w:p>
       <w:pPr>
+        <w:rPr>
+          <w:rFonts w:ascii="Calibri" w:hAnsi="Calibri" w:cs="Calibri"/>
+        </w:rPr>
+      </w:pPr>
+      <w:proofErr w:type="spellStart"/>
+      <w:r>
+        <w:rPr>
+          <w:rFonts w:ascii="Calibri" w:hAnsi="Calibri" w:cs="Calibri"/>
+        </w:rPr>
+        <w:t>Author</w:t>
+      </w:r>
+      <w:proofErr w:type="spellEnd"/>
+      <w:r>
+        <w:rPr>
+          <w:rFonts w:ascii="Calibri" w:hAnsi="Calibri" w:cs="Calibri"/>
+          <w:lang w:val="en-GB"/>
+        </w:rPr>
+        <w:t>s</w:t>
+      </w:r>
+      <w:r>
+        <w:rPr>
+          <w:rFonts w:ascii="Calibri" w:hAnsi="Calibri" w:cs="Calibri"/>
+        </w:rPr>
+        <w:t xml:space="preserve">: </w:t>
+      </w:r>
+      <w:r>
+        <w:rPr>
+          <w:rFonts w:ascii="Calibri" w:hAnsi="Calibri" w:cs="Calibri"/>
+        </w:rPr>
+        <w:t xml:space="preserve">Τσούλης Αθανάσιος-Ανδρέας, </w:t>
+      </w:r>
+      <w:proofErr w:type="spellStart"/>
+      <w:r>
+        <w:rPr>
+          <w:rFonts w:ascii="Calibri" w:hAnsi="Calibri" w:cs="Calibri"/>
+        </w:rPr>
+        <w:t>Γερόλυμος</w:t>
+      </w:r>
+      <w:proofErr w:type="spellEnd"/>
+      <w:r>
+        <w:rPr>
+          <w:rFonts w:ascii="Calibri" w:hAnsi="Calibri" w:cs="Calibri"/>
+        </w:rPr>
+        <w:t xml:space="preserve"> Γεράσιμος</w:t>
+      </w:r>
+    </w:p>
+    <w:p>
+      <w:pPr>
         <w:ind w:left="-5" w:right="5126"/>
         <w:rPr>
           <w:rFonts w:ascii="Calibri" w:hAnsi="Calibri" w:cs="Calibri"/>
           <w:lang w:val="en-GB"/>
         </w:rPr>
       </w:pPr>
-      <w:proofErr w:type="spellStart"/>
-      <w:r>
-        <w:rPr>
-          <w:rFonts w:ascii="Calibri" w:hAnsi="Calibri" w:cs="Calibri"/>
-        </w:rPr>
-        <w:t>Author</w:t>
-      </w:r>
-      <w:proofErr w:type="spellEnd"/>
-      <w:r>
-        <w:rPr>
-          <w:rFonts w:ascii="Calibri" w:hAnsi="Calibri" w:cs="Calibri"/>
-        </w:rPr>
-        <w:t xml:space="preserve">: </w:t>
-      </w:r>
-      <w:proofErr w:type="spellStart"/>
-      <w:r>
-        <w:rPr>
-          <w:rFonts w:ascii="Calibri" w:hAnsi="Calibri" w:cs="Calibri"/>
-        </w:rPr>
-        <w:t>Σπηλιωτακόπουλος</w:t>
-      </w:r>
-      <w:proofErr w:type="spellEnd"/>
-      <w:r>
-        <w:rPr>
-          <w:rFonts w:ascii="Calibri" w:hAnsi="Calibri" w:cs="Calibri"/>
-        </w:rPr>
-        <w:t xml:space="preserve"> Αθανάσιος </w:t>
-      </w:r>
-      <w:proofErr w:type="spellStart"/>
-      <w:r>
-        <w:rPr>
-          <w:rFonts w:ascii="Calibri" w:hAnsi="Calibri" w:cs="Calibri"/>
-        </w:rPr>
-        <w:t>Editor</w:t>
-      </w:r>
-      <w:proofErr w:type="spellEnd"/>
-      <w:r>
-        <w:rPr>
-          <w:rFonts w:ascii="Calibri" w:hAnsi="Calibri" w:cs="Calibri"/>
-        </w:rPr>
-        <w:t xml:space="preserve">: Βουγιουκλής Ξέρξης – Εμμανουήλ </w:t>
-      </w:r>
-      <w:proofErr w:type="spellStart"/>
-      <w:r>
-        <w:rPr>
-          <w:rFonts w:ascii="Calibri" w:hAnsi="Calibri" w:cs="Calibri"/>
-        </w:rPr>
-        <w:t>Graphics</w:t>
-      </w:r>
-      <w:proofErr w:type="spellEnd"/>
-      <w:r>
-        <w:rPr>
-          <w:rFonts w:ascii="Calibri" w:hAnsi="Calibri" w:cs="Calibri"/>
-        </w:rPr>
-        <w:t>:</w:t>
+      <w:r>
+        <w:rPr>
+          <w:rFonts w:ascii="Calibri" w:hAnsi="Calibri" w:cs="Calibri"/>
+          <w:lang w:val="en-GB"/>
+        </w:rPr>
+        <w:t xml:space="preserve">Editor: </w:t>
+      </w:r>
+      <w:r>
+        <w:rPr>
+          <w:rFonts w:ascii="Calibri" w:hAnsi="Calibri" w:cs="Calibri"/>
+        </w:rPr>
+        <w:t>Βουγιουκλής</w:t>
+      </w:r>
+      <w:r>
+        <w:rPr>
+          <w:rFonts w:ascii="Calibri" w:hAnsi="Calibri" w:cs="Calibri"/>
+          <w:lang w:val="en-GB"/>
+        </w:rPr>
+        <w:t xml:space="preserve"> </w:t>
+      </w:r>
+      <w:r>
+        <w:rPr>
+          <w:rFonts w:ascii="Calibri" w:hAnsi="Calibri" w:cs="Calibri"/>
+        </w:rPr>
+        <w:t>Ξέρξης</w:t>
+      </w:r>
+      <w:r>
+        <w:rPr>
+          <w:rFonts w:ascii="Calibri" w:hAnsi="Calibri" w:cs="Calibri"/>
+          <w:lang w:val="en-GB"/>
+        </w:rPr>
+        <w:t xml:space="preserve"> – </w:t>
+      </w:r>
+      <w:r>
+        <w:rPr>
+          <w:rFonts w:ascii="Calibri" w:hAnsi="Calibri" w:cs="Calibri"/>
+        </w:rPr>
+        <w:t>Εμμανουήλ</w:t>
+      </w:r>
+      <w:r>
+        <w:rPr>
+          <w:rFonts w:ascii="Calibri" w:hAnsi="Calibri" w:cs="Calibri"/>
+          <w:lang w:val="en-GB"/>
+        </w:rPr>
+        <w:t xml:space="preserve"> </w:t>
       </w:r>
     </w:p>
     <w:p>
@@ -725,6 +797,7 @@
         <w:ind w:left="0" w:right="5126" w:firstLine="0"/>
         <w:rPr>
           <w:rFonts w:ascii="Calibri" w:hAnsi="Calibri" w:cs="Calibri"/>
+          <w:lang w:val="en-GB"/>
         </w:rPr>
       </w:pPr>
     </w:p>
@@ -745,7 +818,6 @@
           <w:bCs/>
           <w:sz w:val="36"/>
           <w:szCs w:val="36"/>
-          <w:lang w:val="en-GB"/>
         </w:rPr>
       </w:pPr>
       <w:r>
@@ -758,192 +830,19 @@
           <w:lang w:val="en-GB"/>
         </w:rPr>
         <w:lastRenderedPageBreak/>
-        <w:t>Domain Model</w:t>
-      </w:r>
-    </w:p>
-    <w:p>
-      <w:pPr>
-        <w:rPr>
-          <w:rFonts w:ascii="Calibri" w:hAnsi="Calibri" w:cs="Calibri"/>
-        </w:rPr>
-      </w:pPr>
-      <w:r>
-        <w:rPr>
-          <w:rFonts w:ascii="Calibri" w:hAnsi="Calibri" w:cs="Calibri"/>
-        </w:rPr>
-        <w:t>Η δημιουργία του</w:t>
-      </w:r>
-      <w:r>
-        <w:rPr>
-          <w:rFonts w:ascii="Calibri" w:hAnsi="Calibri" w:cs="Calibri"/>
-        </w:rPr>
-        <w:t xml:space="preserve"> διαγράμματος έγινε με το εργαλείο </w:t>
-      </w:r>
-      <w:r>
-        <w:rPr>
-          <w:rFonts w:ascii="Calibri" w:hAnsi="Calibri" w:cs="Calibri"/>
-          <w:lang w:val="en-GB"/>
-        </w:rPr>
-        <w:t>draw</w:t>
-      </w:r>
-      <w:r>
-        <w:rPr>
-          <w:rFonts w:ascii="Calibri" w:hAnsi="Calibri" w:cs="Calibri"/>
-        </w:rPr>
-        <w:t>.</w:t>
-      </w:r>
-      <w:r>
-        <w:rPr>
-          <w:rFonts w:ascii="Calibri" w:hAnsi="Calibri" w:cs="Calibri"/>
-          <w:lang w:val="en-GB"/>
-        </w:rPr>
-        <w:t>io</w:t>
-      </w:r>
-      <w:r>
-        <w:rPr>
-          <w:rFonts w:ascii="Calibri" w:hAnsi="Calibri" w:cs="Calibri"/>
-        </w:rPr>
-        <w:t>. Στην παρούσα έκδοση (</w:t>
-      </w:r>
-      <w:r>
-        <w:rPr>
-          <w:rFonts w:ascii="Calibri" w:hAnsi="Calibri" w:cs="Calibri"/>
-          <w:lang w:val="en-GB"/>
-        </w:rPr>
-        <w:t>v</w:t>
-      </w:r>
-      <w:r>
-        <w:rPr>
-          <w:rFonts w:ascii="Calibri" w:hAnsi="Calibri" w:cs="Calibri"/>
-        </w:rPr>
-        <w:t>0.1)</w:t>
-      </w:r>
-      <w:r>
-        <w:rPr>
-          <w:rFonts w:ascii="Calibri" w:hAnsi="Calibri" w:cs="Calibri"/>
-        </w:rPr>
-        <w:t xml:space="preserve"> προστέθηκαν τα ονόματα των κλάσεων όπως προέκυψαν από την περιγραφή της εφαρμογής, οι σχέσεις (</w:t>
-      </w:r>
-      <w:r>
-        <w:rPr>
-          <w:rFonts w:ascii="Calibri" w:hAnsi="Calibri" w:cs="Calibri"/>
-          <w:lang w:val="en-GB"/>
-        </w:rPr>
-        <w:t>relations</w:t>
-      </w:r>
-      <w:r>
-        <w:rPr>
-          <w:rFonts w:ascii="Calibri" w:hAnsi="Calibri" w:cs="Calibri"/>
-        </w:rPr>
-        <w:t xml:space="preserve">) </w:t>
-      </w:r>
-      <w:r>
-        <w:rPr>
-          <w:rFonts w:ascii="Calibri" w:hAnsi="Calibri" w:cs="Calibri"/>
-        </w:rPr>
-        <w:t xml:space="preserve">μεταξύ τους καθώς και τα </w:t>
-      </w:r>
-      <w:r>
-        <w:rPr>
-          <w:rFonts w:ascii="Calibri" w:hAnsi="Calibri" w:cs="Calibri"/>
-          <w:lang w:val="en-GB"/>
-        </w:rPr>
-        <w:t>multiplicities</w:t>
-      </w:r>
-      <w:r>
-        <w:rPr>
-          <w:rFonts w:ascii="Calibri" w:hAnsi="Calibri" w:cs="Calibri"/>
-        </w:rPr>
-        <w:t>.</w:t>
-      </w:r>
-      <w:r>
-        <w:rPr>
-          <w:rFonts w:ascii="Calibri" w:hAnsi="Calibri" w:cs="Calibri"/>
-        </w:rPr>
-        <w:t xml:space="preserve"> </w:t>
-      </w:r>
-      <w:r>
-        <w:rPr>
-          <w:rFonts w:ascii="Calibri" w:hAnsi="Calibri" w:cs="Calibri"/>
-        </w:rPr>
-        <w:t xml:space="preserve">Η σχεδίαση προσπαθήσαμε, όσο είναι εφικτό, να ακολουθεί την </w:t>
-      </w:r>
-      <w:proofErr w:type="spellStart"/>
-      <w:r>
-        <w:rPr>
-          <w:rFonts w:ascii="Calibri" w:hAnsi="Calibri" w:cs="Calibri"/>
-        </w:rPr>
-        <w:t>οντοκεντρική</w:t>
-      </w:r>
-      <w:proofErr w:type="spellEnd"/>
-      <w:r>
-        <w:rPr>
-          <w:rFonts w:ascii="Calibri" w:hAnsi="Calibri" w:cs="Calibri"/>
-        </w:rPr>
-        <w:t xml:space="preserve"> φιλοσοφία και τις πρακτικές.</w:t>
-      </w:r>
-    </w:p>
-    <w:p>
-      <w:pPr>
-        <w:rPr>
-          <w:rFonts w:ascii="Calibri" w:hAnsi="Calibri" w:cs="Calibri"/>
-        </w:rPr>
-      </w:pPr>
-      <w:r>
-        <w:rPr>
-          <w:rFonts w:ascii="Calibri" w:hAnsi="Calibri" w:cs="Calibri"/>
-        </w:rPr>
-        <w:t xml:space="preserve">Αναφέρουμε πως οι μέθοδοι και τα </w:t>
-      </w:r>
-      <w:r>
-        <w:rPr>
-          <w:rFonts w:ascii="Calibri" w:hAnsi="Calibri" w:cs="Calibri"/>
-          <w:lang w:val="en-GB"/>
-        </w:rPr>
-        <w:t>instance</w:t>
-      </w:r>
-      <w:r>
-        <w:rPr>
-          <w:rFonts w:ascii="Calibri" w:hAnsi="Calibri" w:cs="Calibri"/>
-        </w:rPr>
-        <w:t xml:space="preserve"> </w:t>
-      </w:r>
-      <w:r>
-        <w:rPr>
-          <w:rFonts w:ascii="Calibri" w:hAnsi="Calibri" w:cs="Calibri"/>
-          <w:lang w:val="en-GB"/>
-        </w:rPr>
-        <w:t>variables</w:t>
-      </w:r>
-      <w:r>
-        <w:rPr>
-          <w:rFonts w:ascii="Calibri" w:hAnsi="Calibri" w:cs="Calibri"/>
-        </w:rPr>
-        <w:t xml:space="preserve"> </w:t>
-      </w:r>
-      <w:r>
-        <w:rPr>
-          <w:rFonts w:ascii="Calibri" w:hAnsi="Calibri" w:cs="Calibri"/>
-        </w:rPr>
-        <w:t xml:space="preserve">της κάθε κλάσης θα προστεθούν σε μεταγενέστερη έκδοση. </w:t>
-      </w:r>
-    </w:p>
-    <w:p>
-      <w:pPr>
-        <w:ind w:left="-5" w:right="5126"/>
+        <w:t>Domain</w:t>
+      </w:r>
+      <w:r>
         <w:rPr>
           <w:rFonts w:ascii="Calibri" w:hAnsi="Calibri" w:cs="Calibri"/>
           <w:b/>
           <w:bCs/>
           <w:sz w:val="36"/>
           <w:szCs w:val="36"/>
-          <w:lang w:val="en-GB"/>
-        </w:rPr>
-      </w:pPr>
-    </w:p>
-    <w:p>
-      <w:pPr>
-        <w:ind w:left="-5" w:right="5126"/>
+        </w:rPr>
+        <w:t xml:space="preserve"> </w:t>
+      </w:r>
+      <w:r>
         <w:rPr>
           <w:rFonts w:ascii="Calibri" w:hAnsi="Calibri" w:cs="Calibri"/>
           <w:b/>
@@ -952,7 +851,175 @@
           <w:szCs w:val="36"/>
           <w:lang w:val="en-GB"/>
         </w:rPr>
-      </w:pPr>
+        <w:t>Model</w:t>
+      </w:r>
+    </w:p>
+    <w:p>
+      <w:pPr>
+        <w:rPr>
+          <w:rFonts w:ascii="Calibri" w:hAnsi="Calibri" w:cs="Calibri"/>
+        </w:rPr>
+      </w:pPr>
+      <w:r>
+        <w:rPr>
+          <w:rFonts w:ascii="Calibri" w:hAnsi="Calibri" w:cs="Calibri"/>
+        </w:rPr>
+        <w:t>Η δημιουργία του</w:t>
+      </w:r>
+      <w:r>
+        <w:rPr>
+          <w:rFonts w:ascii="Calibri" w:hAnsi="Calibri" w:cs="Calibri"/>
+        </w:rPr>
+        <w:t xml:space="preserve"> διαγράμματος έγινε με το εργαλείο </w:t>
+      </w:r>
+      <w:r>
+        <w:rPr>
+          <w:rFonts w:ascii="Calibri" w:hAnsi="Calibri" w:cs="Calibri"/>
+          <w:lang w:val="en-GB"/>
+        </w:rPr>
+        <w:t>draw</w:t>
+      </w:r>
+      <w:r>
+        <w:rPr>
+          <w:rFonts w:ascii="Calibri" w:hAnsi="Calibri" w:cs="Calibri"/>
+        </w:rPr>
+        <w:t>.</w:t>
+      </w:r>
+      <w:r>
+        <w:rPr>
+          <w:rFonts w:ascii="Calibri" w:hAnsi="Calibri" w:cs="Calibri"/>
+          <w:lang w:val="en-GB"/>
+        </w:rPr>
+        <w:t>io</w:t>
+      </w:r>
+      <w:r>
+        <w:rPr>
+          <w:rFonts w:ascii="Calibri" w:hAnsi="Calibri" w:cs="Calibri"/>
+        </w:rPr>
+        <w:t>. Στην παρούσα έκδοση (</w:t>
+      </w:r>
+      <w:r>
+        <w:rPr>
+          <w:rFonts w:ascii="Calibri" w:hAnsi="Calibri" w:cs="Calibri"/>
+          <w:lang w:val="en-GB"/>
+        </w:rPr>
+        <w:t>v</w:t>
+      </w:r>
+      <w:r>
+        <w:rPr>
+          <w:rFonts w:ascii="Calibri" w:hAnsi="Calibri" w:cs="Calibri"/>
+        </w:rPr>
+        <w:t>0.1)</w:t>
+      </w:r>
+      <w:r>
+        <w:rPr>
+          <w:rFonts w:ascii="Calibri" w:hAnsi="Calibri" w:cs="Calibri"/>
+        </w:rPr>
+        <w:t xml:space="preserve"> προστέθηκαν τα ονόματα των κλάσεων όπως προέκυψαν από την περιγραφή της εφαρμογής, οι σχέσεις (</w:t>
+      </w:r>
+      <w:r>
+        <w:rPr>
+          <w:rFonts w:ascii="Calibri" w:hAnsi="Calibri" w:cs="Calibri"/>
+          <w:lang w:val="en-GB"/>
+        </w:rPr>
+        <w:t>relations</w:t>
+      </w:r>
+      <w:r>
+        <w:rPr>
+          <w:rFonts w:ascii="Calibri" w:hAnsi="Calibri" w:cs="Calibri"/>
+        </w:rPr>
+        <w:t xml:space="preserve">) </w:t>
+      </w:r>
+      <w:r>
+        <w:rPr>
+          <w:rFonts w:ascii="Calibri" w:hAnsi="Calibri" w:cs="Calibri"/>
+        </w:rPr>
+        <w:t xml:space="preserve">μεταξύ τους καθώς και τα </w:t>
+      </w:r>
+      <w:r>
+        <w:rPr>
+          <w:rFonts w:ascii="Calibri" w:hAnsi="Calibri" w:cs="Calibri"/>
+          <w:lang w:val="en-GB"/>
+        </w:rPr>
+        <w:t>multiplicities</w:t>
+      </w:r>
+      <w:r>
+        <w:rPr>
+          <w:rFonts w:ascii="Calibri" w:hAnsi="Calibri" w:cs="Calibri"/>
+        </w:rPr>
+        <w:t>.</w:t>
+      </w:r>
+      <w:r>
+        <w:rPr>
+          <w:rFonts w:ascii="Calibri" w:hAnsi="Calibri" w:cs="Calibri"/>
+        </w:rPr>
+        <w:t xml:space="preserve"> </w:t>
+      </w:r>
+      <w:r>
+        <w:rPr>
+          <w:rFonts w:ascii="Calibri" w:hAnsi="Calibri" w:cs="Calibri"/>
+        </w:rPr>
+        <w:t xml:space="preserve">Η σχεδίαση προσπαθήσαμε, όσο είναι εφικτό, να ακολουθεί την </w:t>
+      </w:r>
+      <w:proofErr w:type="spellStart"/>
+      <w:r>
+        <w:rPr>
+          <w:rFonts w:ascii="Calibri" w:hAnsi="Calibri" w:cs="Calibri"/>
+        </w:rPr>
+        <w:t>οντοκεντρική</w:t>
+      </w:r>
+      <w:proofErr w:type="spellEnd"/>
+      <w:r>
+        <w:rPr>
+          <w:rFonts w:ascii="Calibri" w:hAnsi="Calibri" w:cs="Calibri"/>
+        </w:rPr>
+        <w:t xml:space="preserve"> φιλοσοφία και τις πρακτικές.</w:t>
+      </w:r>
+    </w:p>
+    <w:p>
+      <w:pPr>
+        <w:rPr>
+          <w:rFonts w:ascii="Calibri" w:hAnsi="Calibri" w:cs="Calibri"/>
+        </w:rPr>
+      </w:pPr>
+      <w:r>
+        <w:rPr>
+          <w:rFonts w:ascii="Calibri" w:hAnsi="Calibri" w:cs="Calibri"/>
+        </w:rPr>
+        <w:t xml:space="preserve">Αναφέρουμε πως οι μέθοδοι και τα </w:t>
+      </w:r>
+      <w:r>
+        <w:rPr>
+          <w:rFonts w:ascii="Calibri" w:hAnsi="Calibri" w:cs="Calibri"/>
+          <w:lang w:val="en-GB"/>
+        </w:rPr>
+        <w:t>instance</w:t>
+      </w:r>
+      <w:r>
+        <w:rPr>
+          <w:rFonts w:ascii="Calibri" w:hAnsi="Calibri" w:cs="Calibri"/>
+        </w:rPr>
+        <w:t xml:space="preserve"> </w:t>
+      </w:r>
+      <w:r>
+        <w:rPr>
+          <w:rFonts w:ascii="Calibri" w:hAnsi="Calibri" w:cs="Calibri"/>
+          <w:lang w:val="en-GB"/>
+        </w:rPr>
+        <w:t>variables</w:t>
+      </w:r>
+      <w:r>
+        <w:rPr>
+          <w:rFonts w:ascii="Calibri" w:hAnsi="Calibri" w:cs="Calibri"/>
+        </w:rPr>
+        <w:t xml:space="preserve"> </w:t>
+      </w:r>
+      <w:r>
+        <w:rPr>
+          <w:rFonts w:ascii="Calibri" w:hAnsi="Calibri" w:cs="Calibri"/>
+        </w:rPr>
+        <w:t xml:space="preserve">της κάθε κλάσης θα προστεθούν σε μεταγενέστερη έκδοση. </w:t>
+      </w:r>
     </w:p>
     <w:p>
       <w:pPr>
@@ -963,10 +1030,12 @@
           <w:bCs/>
           <w:sz w:val="36"/>
           <w:szCs w:val="36"/>
-          <w:lang w:val="en-GB"/>
-        </w:rPr>
-      </w:pPr>
-      <w:r>
+        </w:rPr>
+      </w:pPr>
+    </w:p>
+    <w:p>
+      <w:pPr>
+        <w:ind w:left="-5" w:right="5126"/>
         <w:rPr>
           <w:rFonts w:ascii="Calibri" w:hAnsi="Calibri" w:cs="Calibri"/>
           <w:b/>
@@ -974,8 +1043,7 @@
           <w:sz w:val="36"/>
           <w:szCs w:val="36"/>
         </w:rPr>
-        <w:t>Διάγραμμα</w:t>
-      </w:r>
+      </w:pPr>
     </w:p>
     <w:p>
       <w:pPr>
@@ -986,7 +1054,28 @@
           <w:bCs/>
           <w:sz w:val="36"/>
           <w:szCs w:val="36"/>
-          <w:lang w:val="en-GB"/>
+        </w:rPr>
+      </w:pPr>
+      <w:r>
+        <w:rPr>
+          <w:rFonts w:ascii="Calibri" w:hAnsi="Calibri" w:cs="Calibri"/>
+          <w:b/>
+          <w:bCs/>
+          <w:sz w:val="36"/>
+          <w:szCs w:val="36"/>
+        </w:rPr>
+        <w:t>Διάγραμμα</w:t>
+      </w:r>
+    </w:p>
+    <w:p>
+      <w:pPr>
+        <w:ind w:left="-5" w:right="5126"/>
+        <w:rPr>
+          <w:rFonts w:ascii="Calibri" w:hAnsi="Calibri" w:cs="Calibri"/>
+          <w:b/>
+          <w:bCs/>
+          <w:sz w:val="36"/>
+          <w:szCs w:val="36"/>
         </w:rPr>
       </w:pPr>
       <w:r>
@@ -1072,7 +1161,6 @@
           <w:bCs/>
           <w:sz w:val="36"/>
           <w:szCs w:val="36"/>
-          <w:lang w:val="en-GB"/>
         </w:rPr>
       </w:pPr>
     </w:p>
@@ -1085,7 +1173,6 @@
           <w:bCs/>
           <w:sz w:val="36"/>
           <w:szCs w:val="36"/>
-          <w:lang w:val="en-GB"/>
         </w:rPr>
       </w:pPr>
     </w:p>
@@ -1098,7 +1185,6 @@
           <w:bCs/>
           <w:sz w:val="36"/>
           <w:szCs w:val="36"/>
-          <w:lang w:val="en-GB"/>
         </w:rPr>
       </w:pPr>
     </w:p>
@@ -1111,7 +1197,6 @@
           <w:bCs/>
           <w:sz w:val="36"/>
           <w:szCs w:val="36"/>
-          <w:lang w:val="en-GB"/>
         </w:rPr>
       </w:pPr>
     </w:p>
@@ -1124,7 +1209,6 @@
           <w:bCs/>
           <w:sz w:val="36"/>
           <w:szCs w:val="36"/>
-          <w:lang w:val="en-GB"/>
         </w:rPr>
       </w:pPr>
     </w:p>
@@ -1744,13 +1828,7 @@
         <w:rPr>
           <w:rFonts w:ascii="Calibri" w:hAnsi="Calibri" w:cs="Calibri"/>
         </w:rPr>
-        <w:t>Π</w:t>
-      </w:r>
-      <w:r>
-        <w:rPr>
-          <w:rFonts w:ascii="Calibri" w:hAnsi="Calibri" w:cs="Calibri"/>
-        </w:rPr>
-        <w:t>ληροφορίες του προϊόντος όπως όνομα, κατηγορία (εξοπλισμός γυμναστικής,</w:t>
+        <w:t>Πληροφορίες του προϊόντος όπως όνομα, κατηγορία (εξοπλισμός γυμναστικής,</w:t>
       </w:r>
       <w:r>
         <w:t xml:space="preserve"> συμπληρώματα διατροφής </w:t>
@@ -3288,6 +3366,7 @@
   <w:style w:type="character" w:default="1" w:styleId="DefaultParagraphFont">
     <w:name w:val="Default Paragraph Font"/>
     <w:uiPriority w:val="1"/>
+    <w:semiHidden/>
     <w:unhideWhenUsed/>
   </w:style>
   <w:style w:type="table" w:default="1" w:styleId="TableNormal">

</xml_diff>